<commit_message>
doc: Research document modified
</commit_message>
<xml_diff>
--- a/Decision Logs/Decision-log-3-API_vs_Manual.docx
+++ b/Decision Logs/Decision-log-3-API_vs_Manual.docx
@@ -569,14 +569,7 @@
           <w:i/>
           <w:iCs/>
         </w:rPr>
-        <w:t>[</w:t>
-      </w:r>
-      <w:r>
-        <w:rPr>
-          <w:i/>
-          <w:iCs/>
-        </w:rPr>
-        <w:t>Available product analysis</w:t>
+        <w:t>[Available product analysis</w:t>
       </w:r>
       <w:r>
         <w:t xml:space="preserve">] </w:t>
@@ -744,6 +737,36 @@
     <w:p>
       <w:pPr>
         <w:rPr>
+          <w:rFonts w:ascii="Cambria" w:hAnsi="Cambria"/>
+        </w:rPr>
+      </w:pPr>
+      <w:r>
+        <w:rPr>
+          <w:rFonts w:ascii="Cambria" w:hAnsi="Cambria"/>
+        </w:rPr>
+        <w:t xml:space="preserve">The </w:t>
+      </w:r>
+      <w:hyperlink r:id="rId6" w:history="1">
+        <w:r>
+          <w:rPr>
+            <w:rStyle w:val="Hyperlink"/>
+          </w:rPr>
+          <w:t>API vs manual Research</w:t>
+        </w:r>
+      </w:hyperlink>
+      <w:r>
+        <w:t xml:space="preserve"> </w:t>
+      </w:r>
+      <w:r>
+        <w:rPr>
+          <w:rFonts w:ascii="Cambria" w:hAnsi="Cambria"/>
+        </w:rPr>
+        <w:t>document supports and confirms the findings discussed in this research</w:t>
+      </w:r>
+    </w:p>
+    <w:p>
+      <w:pPr>
+        <w:rPr>
           <w:b/>
           <w:bCs/>
           <w:i/>
@@ -775,7 +798,7 @@
         </w:rPr>
         <w:t xml:space="preserve">: </w:t>
       </w:r>
-      <w:hyperlink r:id="rId6" w:history="1">
+      <w:hyperlink r:id="rId7" w:history="1">
         <w:r>
           <w:rPr>
             <w:rStyle w:val="Hyperlink"/>
@@ -785,20 +808,15 @@
       </w:hyperlink>
     </w:p>
     <w:p>
-      <w:pPr>
-        <w:rPr>
-          <w:lang w:val="en-GB"/>
-        </w:rPr>
-      </w:pPr>
       <w:r>
         <w:t xml:space="preserve">OpenAI. (2026). ChatGPT Socratic dialogue discussion (March 17 version) [Large language model]. </w:t>
       </w:r>
-      <w:hyperlink r:id="rId7" w:history="1">
+      <w:hyperlink r:id="rId8" w:history="1">
         <w:r>
           <w:rPr>
             <w:rStyle w:val="Hyperlink"/>
           </w:rPr>
-          <w:t>https://chatgpt.com/share/69b9376d-7</w:t>
+          <w:t>https://chatgpt.com/share/69b9376d-7154-8002-86e0-07b69</w:t>
         </w:r>
         <w:r>
           <w:rPr>
@@ -810,12 +828,19 @@
           <w:rPr>
             <w:rStyle w:val="Hyperlink"/>
           </w:rPr>
-          <w:t>54-8002-86e0-07b6912c12ee</w:t>
+          <w:t>2c12ee</w:t>
         </w:r>
       </w:hyperlink>
       <w:r>
         <w:t xml:space="preserve"> </w:t>
       </w:r>
+    </w:p>
+    <w:p>
+      <w:pPr>
+        <w:rPr>
+          <w:lang w:val="en-GB"/>
+        </w:rPr>
+      </w:pPr>
     </w:p>
     <w:p>
       <w:pPr>
@@ -862,7 +887,7 @@
                     <pic:cNvPicPr/>
                   </pic:nvPicPr>
                   <pic:blipFill>
-                    <a:blip r:embed="rId8"/>
+                    <a:blip r:embed="rId9"/>
                     <a:stretch>
                       <a:fillRect/>
                     </a:stretch>
@@ -1324,13 +1349,7 @@
         <w:rPr>
           <w:lang w:val="en-GB"/>
         </w:rPr>
-        <w:t>• APIs return stable and comparable outputs across multiple requests</w:t>
-      </w:r>
-      <w:r>
-        <w:rPr>
-          <w:lang w:val="en-GB"/>
-        </w:rPr>
-        <w:t xml:space="preserve"> </w:t>
+        <w:t xml:space="preserve">• APIs return stable and comparable outputs across multiple requests </w:t>
       </w:r>
       <w:r>
         <w:rPr>
@@ -2489,6 +2508,7 @@
   <w:style w:type="character" w:default="1" w:styleId="DefaultParagraphFont">
     <w:name w:val="Default Paragraph Font"/>
     <w:uiPriority w:val="1"/>
+    <w:semiHidden/>
     <w:unhideWhenUsed/>
   </w:style>
   <w:style w:type="table" w:default="1" w:styleId="TableNormal">

</xml_diff>